<commit_message>
Add premium PDF edition of the Social Media & Client Acquisition plan
- New RTL A4 PDF (42 pages) rendered from a custom branded layout:
  navy/gold cover, auto-generated table of contents with page numbers,
  numbered section openers, styled tables, org chart, production
  pipeline and lead funnel diagrams, running header/footer.
- Markdown source: add blank lines between bold labels and the lists
  that follow so list items render as lists instead of merged paragraphs.
- Regenerated the DOCX from the corrected source.

Co-Authored-By: Claude Fable 5.1 <noreply@anthropic.com>
Claude-Session: https://claude.ai/code/session_0135S5juTkqJSNLSzzprRsuz
</commit_message>
<xml_diff>
--- a/RK_Social_Media_and_Client_Acquisition_Plan.docx
+++ b/RK_Social_Media_and_Client_Acquisition_Plan.docx
@@ -3478,22 +3478,38 @@
         </w:rPr>
         <w:t xml:space="preserve">الحسابات:</w:t>
       </w:r>
-      <w:r>
-        <w:t xml:space="preserve"> </w:t>
-      </w:r>
-      <w:r>
-        <w:t xml:space="preserve">- حساب د. راشد الكيتوب الشخصي (الأساسي).</w:t>
-      </w:r>
-      <w:r>
-        <w:t xml:space="preserve"> </w:t>
-      </w:r>
-      <w:r>
-        <w:t xml:space="preserve">- حساب المكتب (داعم؛ يعيد النشر ويضيف الزاوية المؤسسية).</w:t>
-      </w:r>
-    </w:p>
-    <w:p>
-      <w:pPr>
-        <w:pStyle w:val="BodyText"/>
+    </w:p>
+    <w:p>
+      <w:pPr>
+        <w:numPr>
+          <w:ilvl w:val="0"/>
+          <w:numId w:val="1007"/>
+        </w:numPr>
+        <w:pStyle w:val="Compact"/>
+        <w:bidi/>
+        <w:jc w:val="right"/>
+      </w:pPr>
+      <w:r>
+        <w:t xml:space="preserve">حساب د. راشد الكيتوب الشخصي (الأساسي).</w:t>
+      </w:r>
+    </w:p>
+    <w:p>
+      <w:pPr>
+        <w:numPr>
+          <w:ilvl w:val="0"/>
+          <w:numId w:val="1007"/>
+        </w:numPr>
+        <w:pStyle w:val="Compact"/>
+        <w:bidi/>
+        <w:jc w:val="right"/>
+      </w:pPr>
+      <w:r>
+        <w:t xml:space="preserve">حساب المكتب (داعم؛ يعيد النشر ويضيف الزاوية المؤسسية).</w:t>
+      </w:r>
+    </w:p>
+    <w:p>
+      <w:pPr>
+        <w:pStyle w:val="FirstParagraph"/>
         <w:bidi/>
         <w:jc w:val="right"/>
       </w:pPr>
@@ -3916,35 +3932,75 @@
         </w:rPr>
         <w:t xml:space="preserve">(Legislative Radar):</w:t>
       </w:r>
-      <w:r>
-        <w:t xml:space="preserve"> </w:t>
-      </w:r>
-      <w:r>
-        <w:t xml:space="preserve">1. متابعة يومية (صباحاً) للجريدة الرسمية، ومواقع وزارة العدل، والمجلس الأعلى للتشريع، وحسابات الجهات الحكومية، والبوابات التشريعية في الإمارات.</w:t>
-      </w:r>
-      <w:r>
-        <w:t xml:space="preserve"> </w:t>
-      </w:r>
-      <w:r>
-        <w:t xml:space="preserve">2. عند صدور تشريع: الباحث القانوني يعدّ ملخصاً من صفحة واحدة خلال ساعة.</w:t>
-      </w:r>
-      <w:r>
-        <w:t xml:space="preserve"> </w:t>
-      </w:r>
-      <w:r>
-        <w:t xml:space="preserve">3. كاتب المحتوى يحوّله إلى ثريد ومسودة فيديو خلال ساعة.</w:t>
-      </w:r>
-      <w:r>
-        <w:t xml:space="preserve"> </w:t>
-      </w:r>
-      <w:r>
-        <w:t xml:space="preserve">4. د. راشد يعتمد أو يعدّل (قناة واتساب مخصصة للاعتماد السريع).</w:t>
-      </w:r>
-      <w:r>
-        <w:t xml:space="preserve"> </w:t>
-      </w:r>
-      <w:r>
-        <w:t xml:space="preserve">5. النشر على X أولاً، ثم لينكدإن (نسخة مؤسسية)، ثم إنستغرام (تصميم + ريل)، ثم مقال على الموقع خلال 24-48 ساعة لالتقاط البحث على جوجل.</w:t>
+    </w:p>
+    <w:p>
+      <w:pPr>
+        <w:numPr>
+          <w:ilvl w:val="0"/>
+          <w:numId w:val="1008"/>
+        </w:numPr>
+        <w:pStyle w:val="Compact"/>
+        <w:bidi/>
+        <w:jc w:val="right"/>
+      </w:pPr>
+      <w:r>
+        <w:t xml:space="preserve">متابعة يومية (صباحاً) للجريدة الرسمية، ومواقع وزارة العدل، والمجلس الأعلى للتشريع، وحسابات الجهات الحكومية، والبوابات التشريعية في الإمارات.</w:t>
+      </w:r>
+    </w:p>
+    <w:p>
+      <w:pPr>
+        <w:numPr>
+          <w:ilvl w:val="0"/>
+          <w:numId w:val="1008"/>
+        </w:numPr>
+        <w:pStyle w:val="Compact"/>
+        <w:bidi/>
+        <w:jc w:val="right"/>
+      </w:pPr>
+      <w:r>
+        <w:t xml:space="preserve">عند صدور تشريع: الباحث القانوني يعدّ ملخصاً من صفحة واحدة خلال ساعة.</w:t>
+      </w:r>
+    </w:p>
+    <w:p>
+      <w:pPr>
+        <w:numPr>
+          <w:ilvl w:val="0"/>
+          <w:numId w:val="1008"/>
+        </w:numPr>
+        <w:pStyle w:val="Compact"/>
+        <w:bidi/>
+        <w:jc w:val="right"/>
+      </w:pPr>
+      <w:r>
+        <w:t xml:space="preserve">كاتب المحتوى يحوّله إلى ثريد ومسودة فيديو خلال ساعة.</w:t>
+      </w:r>
+    </w:p>
+    <w:p>
+      <w:pPr>
+        <w:numPr>
+          <w:ilvl w:val="0"/>
+          <w:numId w:val="1008"/>
+        </w:numPr>
+        <w:pStyle w:val="Compact"/>
+        <w:bidi/>
+        <w:jc w:val="right"/>
+      </w:pPr>
+      <w:r>
+        <w:t xml:space="preserve">د. راشد يعتمد أو يعدّل (قناة واتساب مخصصة للاعتماد السريع).</w:t>
+      </w:r>
+    </w:p>
+    <w:p>
+      <w:pPr>
+        <w:numPr>
+          <w:ilvl w:val="0"/>
+          <w:numId w:val="1008"/>
+        </w:numPr>
+        <w:pStyle w:val="Compact"/>
+        <w:bidi/>
+        <w:jc w:val="right"/>
+      </w:pPr>
+      <w:r>
+        <w:t xml:space="preserve">النشر على X أولاً، ثم لينكدإن (نسخة مؤسسية)، ثم إنستغرام (تصميم + ريل)، ثم مقال على الموقع خلال 24-48 ساعة لالتقاط البحث على جوجل.</w:t>
       </w:r>
     </w:p>
     <w:bookmarkEnd w:id="34"/>
@@ -4232,52 +4288,84 @@
         </w:rPr>
         <w:t xml:space="preserve">جذب العملاء على فيسبوك:</w:t>
       </w:r>
+    </w:p>
+    <w:p>
+      <w:pPr>
+        <w:numPr>
+          <w:ilvl w:val="0"/>
+          <w:numId w:val="1009"/>
+        </w:numPr>
+        <w:pStyle w:val="Compact"/>
+        <w:bidi/>
+        <w:jc w:val="right"/>
+      </w:pPr>
+      <w:r>
+        <w:t xml:space="preserve">زر</w:t>
+      </w:r>
       <w:r>
         <w:t xml:space="preserve"> </w:t>
       </w:r>
       <w:r>
-        <w:t xml:space="preserve">- زر</w:t>
+        <w:t xml:space="preserve">“</w:t>
+      </w:r>
+      <w:r>
+        <w:t xml:space="preserve">راسلنا</w:t>
+      </w:r>
+      <w:r>
+        <w:t xml:space="preserve">”</w:t>
       </w:r>
       <w:r>
         <w:t xml:space="preserve"> </w:t>
       </w:r>
       <w:r>
-        <w:t xml:space="preserve">“</w:t>
-      </w:r>
-      <w:r>
-        <w:t xml:space="preserve">راسلنا</w:t>
-      </w:r>
-      <w:r>
-        <w:t xml:space="preserve">”</w:t>
-      </w:r>
-      <w:r>
-        <w:t xml:space="preserve"> </w:t>
-      </w:r>
-      <w:r>
         <w:t xml:space="preserve">إلى واتساب للأعمال مع رد تلقائي يسأل 3 أسئلة تأهيلية (نوع القضية، الإمارة، موعد مناسب للاتصال).</w:t>
       </w:r>
-      <w:r>
-        <w:t xml:space="preserve"> </w:t>
-      </w:r>
-      <w:r>
-        <w:t xml:space="preserve">- إعلانات عملاء محتملين (Lead Ads) حسب نوع الخدمة مع نماذج فورية، استهداف جغرافي داخل الإمارات، وتجزئة باللغة (عربي/إنجليزي/أوردو/هندي حسب جدوى كل خدمة).</w:t>
-      </w:r>
-      <w:r>
-        <w:t xml:space="preserve"> </w:t>
-      </w:r>
-      <w:r>
-        <w:t xml:space="preserve">- مجموعات فيسبوك: المشاركة بقيمة (دون إعلان مباشر) في مجموعات المقيمين وأصحاب الأعمال؛ 3 إجابات مفيدة أسبوعياً من حساب المكتب.</w:t>
-      </w:r>
-      <w:r>
-        <w:t xml:space="preserve"> </w:t>
-      </w:r>
-      <w:r>
-        <w:t xml:space="preserve">- إعادة الاستهداف (Retargeting) لزوار الموقع ومشاهدي الفيديو لأكثر من 50%.</w:t>
-      </w:r>
-    </w:p>
-    <w:p>
-      <w:pPr>
-        <w:pStyle w:val="BodyText"/>
+    </w:p>
+    <w:p>
+      <w:pPr>
+        <w:numPr>
+          <w:ilvl w:val="0"/>
+          <w:numId w:val="1009"/>
+        </w:numPr>
+        <w:pStyle w:val="Compact"/>
+        <w:bidi/>
+        <w:jc w:val="right"/>
+      </w:pPr>
+      <w:r>
+        <w:t xml:space="preserve">إعلانات عملاء محتملين (Lead Ads) حسب نوع الخدمة مع نماذج فورية، استهداف جغرافي داخل الإمارات، وتجزئة باللغة (عربي/إنجليزي/أوردو/هندي حسب جدوى كل خدمة).</w:t>
+      </w:r>
+    </w:p>
+    <w:p>
+      <w:pPr>
+        <w:numPr>
+          <w:ilvl w:val="0"/>
+          <w:numId w:val="1009"/>
+        </w:numPr>
+        <w:pStyle w:val="Compact"/>
+        <w:bidi/>
+        <w:jc w:val="right"/>
+      </w:pPr>
+      <w:r>
+        <w:t xml:space="preserve">مجموعات فيسبوك: المشاركة بقيمة (دون إعلان مباشر) في مجموعات المقيمين وأصحاب الأعمال؛ 3 إجابات مفيدة أسبوعياً من حساب المكتب.</w:t>
+      </w:r>
+    </w:p>
+    <w:p>
+      <w:pPr>
+        <w:numPr>
+          <w:ilvl w:val="0"/>
+          <w:numId w:val="1009"/>
+        </w:numPr>
+        <w:pStyle w:val="Compact"/>
+        <w:bidi/>
+        <w:jc w:val="right"/>
+      </w:pPr>
+      <w:r>
+        <w:t xml:space="preserve">إعادة الاستهداف (Retargeting) لزوار الموقع ومشاهدي الفيديو لأكثر من 50%.</w:t>
+      </w:r>
+    </w:p>
+    <w:p>
+      <w:pPr>
+        <w:pStyle w:val="FirstParagraph"/>
         <w:bidi/>
         <w:jc w:val="right"/>
       </w:pPr>
@@ -4606,52 +4694,84 @@
         </w:rPr>
         <w:t xml:space="preserve">جذب العملاء على إنستغرام:</w:t>
       </w:r>
+    </w:p>
+    <w:p>
+      <w:pPr>
+        <w:numPr>
+          <w:ilvl w:val="0"/>
+          <w:numId w:val="1010"/>
+        </w:numPr>
+        <w:pStyle w:val="Compact"/>
+        <w:bidi/>
+        <w:jc w:val="right"/>
+      </w:pPr>
+      <w:r>
+        <w:t xml:space="preserve">رابط البايو إلى صفحة هبوط (Landing Page) موحّدة بخيارات: احجز استشارة / واتساب / تحميل دليل مجاني.</w:t>
+      </w:r>
+    </w:p>
+    <w:p>
+      <w:pPr>
+        <w:numPr>
+          <w:ilvl w:val="0"/>
+          <w:numId w:val="1010"/>
+        </w:numPr>
+        <w:pStyle w:val="Compact"/>
+        <w:bidi/>
+        <w:jc w:val="right"/>
+      </w:pPr>
+      <w:r>
+        <w:t xml:space="preserve">ملصقات</w:t>
+      </w:r>
       <w:r>
         <w:t xml:space="preserve"> </w:t>
       </w:r>
       <w:r>
-        <w:t xml:space="preserve">- رابط البايو إلى صفحة هبوط (Landing Page) موحّدة بخيارات: احجز استشارة / واتساب / تحميل دليل مجاني.</w:t>
+        <w:t xml:space="preserve">“</w:t>
+      </w:r>
+      <w:r>
+        <w:t xml:space="preserve">أسئلة</w:t>
+      </w:r>
+      <w:r>
+        <w:t xml:space="preserve">”</w:t>
       </w:r>
       <w:r>
         <w:t xml:space="preserve"> </w:t>
       </w:r>
       <w:r>
-        <w:t xml:space="preserve">- ملصقات</w:t>
-      </w:r>
-      <w:r>
-        <w:t xml:space="preserve"> </w:t>
-      </w:r>
-      <w:r>
-        <w:t xml:space="preserve">“</w:t>
-      </w:r>
-      <w:r>
-        <w:t xml:space="preserve">أسئلة</w:t>
-      </w:r>
-      <w:r>
-        <w:t xml:space="preserve">”</w:t>
-      </w:r>
-      <w:r>
-        <w:t xml:space="preserve"> </w:t>
-      </w:r>
-      <w:r>
         <w:t xml:space="preserve">و”استطلاع” في الستوري يومياً لرصد الحاجات والردود المباشرة.</w:t>
       </w:r>
-      <w:r>
-        <w:t xml:space="preserve"> </w:t>
-      </w:r>
-      <w:r>
-        <w:t xml:space="preserve">- حملات مدفوعة على الريلز الأعلى أداءً (Boost) ببنود واضحة لجذب العملاء.</w:t>
-      </w:r>
-      <w:r>
-        <w:t xml:space="preserve"> </w:t>
-      </w:r>
-      <w:r>
-        <w:t xml:space="preserve">- ردّ على كل تعليق ورسالة خلال ساعة في أوقات العمل.</w:t>
-      </w:r>
-    </w:p>
-    <w:p>
-      <w:pPr>
-        <w:pStyle w:val="BodyText"/>
+    </w:p>
+    <w:p>
+      <w:pPr>
+        <w:numPr>
+          <w:ilvl w:val="0"/>
+          <w:numId w:val="1010"/>
+        </w:numPr>
+        <w:pStyle w:val="Compact"/>
+        <w:bidi/>
+        <w:jc w:val="right"/>
+      </w:pPr>
+      <w:r>
+        <w:t xml:space="preserve">حملات مدفوعة على الريلز الأعلى أداءً (Boost) ببنود واضحة لجذب العملاء.</w:t>
+      </w:r>
+    </w:p>
+    <w:p>
+      <w:pPr>
+        <w:numPr>
+          <w:ilvl w:val="0"/>
+          <w:numId w:val="1010"/>
+        </w:numPr>
+        <w:pStyle w:val="Compact"/>
+        <w:bidi/>
+        <w:jc w:val="right"/>
+      </w:pPr>
+      <w:r>
+        <w:t xml:space="preserve">ردّ على كل تعليق ورسالة خلال ساعة في أوقات العمل.</w:t>
+      </w:r>
+    </w:p>
+    <w:p>
+      <w:pPr>
+        <w:pStyle w:val="FirstParagraph"/>
         <w:bidi/>
         <w:jc w:val="right"/>
       </w:pPr>
@@ -4714,28 +4834,52 @@
         </w:rPr>
         <w:t xml:space="preserve">الحسابات:</w:t>
       </w:r>
+    </w:p>
+    <w:p>
+      <w:pPr>
+        <w:numPr>
+          <w:ilvl w:val="0"/>
+          <w:numId w:val="1011"/>
+        </w:numPr>
+        <w:pStyle w:val="Compact"/>
+        <w:bidi/>
+        <w:jc w:val="right"/>
+      </w:pPr>
+      <w:r>
+        <w:t xml:space="preserve">صفحة المكتب (Company Page).</w:t>
+      </w:r>
+    </w:p>
+    <w:p>
+      <w:pPr>
+        <w:numPr>
+          <w:ilvl w:val="0"/>
+          <w:numId w:val="1011"/>
+        </w:numPr>
+        <w:pStyle w:val="Compact"/>
+        <w:bidi/>
+        <w:jc w:val="right"/>
+      </w:pPr>
+      <w:r>
+        <w:t xml:space="preserve">حساب د. راشد الكيتوب الشخصي.</w:t>
+      </w:r>
+    </w:p>
+    <w:p>
+      <w:pPr>
+        <w:numPr>
+          <w:ilvl w:val="0"/>
+          <w:numId w:val="1011"/>
+        </w:numPr>
+        <w:pStyle w:val="Compact"/>
+        <w:bidi/>
+        <w:jc w:val="right"/>
+      </w:pPr>
+      <w:r>
+        <w:t xml:space="preserve">حسابات المدير العام ورئيس تطوير الأعمال والمستشارين (برنامج</w:t>
+      </w:r>
       <w:r>
         <w:t xml:space="preserve"> </w:t>
       </w:r>
       <w:r>
-        <w:t xml:space="preserve">- صفحة المكتب (Company Page).</w:t>
-      </w:r>
-      <w:r>
-        <w:t xml:space="preserve"> </w:t>
-      </w:r>
-      <w:r>
-        <w:t xml:space="preserve">- حساب د. راشد الكيتوب الشخصي.</w:t>
-      </w:r>
-      <w:r>
-        <w:t xml:space="preserve"> </w:t>
-      </w:r>
-      <w:r>
-        <w:t xml:space="preserve">- حسابات المدير العام ورئيس تطوير الأعمال والمستشارين (برنامج</w:t>
-      </w:r>
-      <w:r>
-        <w:t xml:space="preserve"> </w:t>
-      </w:r>
-      <w:r>
         <w:t xml:space="preserve">“</w:t>
       </w:r>
       <w:r>
@@ -4750,7 +4894,7 @@
     </w:p>
     <w:p>
       <w:pPr>
-        <w:pStyle w:val="BodyText"/>
+        <w:pStyle w:val="FirstParagraph"/>
         <w:bidi/>
         <w:jc w:val="right"/>
       </w:pPr>
@@ -5039,34 +5183,66 @@
         </w:rPr>
         <w:t xml:space="preserve">جذب العملاء على لينكدإن:</w:t>
       </w:r>
-      <w:r>
-        <w:t xml:space="preserve"> </w:t>
-      </w:r>
-      <w:r>
-        <w:t xml:space="preserve">- استهداف مباشر (Sales Navigator) من فريق تطوير الأعمال لمديري الشؤون القانونية والمديرين الماليين والمؤسسين؛ التسويق يوفّر المحتوى الداعم (رسائل متابعة، أدلة، دعوات ندوات).</w:t>
-      </w:r>
-      <w:r>
-        <w:t xml:space="preserve"> </w:t>
-      </w:r>
-      <w:r>
-        <w:t xml:space="preserve">- نماذج عملاء محتملين من خلال الندوات الإلكترونية (Webinars) المسجّلة على لينكدإن.</w:t>
-      </w:r>
-      <w:r>
-        <w:t xml:space="preserve"> </w:t>
-      </w:r>
-      <w:r>
-        <w:t xml:space="preserve">- الاستجابة لكل تعليق من حساب مؤسسي أو حكومي بشكل شخصي.</w:t>
-      </w:r>
-      <w:r>
-        <w:t xml:space="preserve"> </w:t>
-      </w:r>
-      <w:r>
-        <w:t xml:space="preserve">- المحتوى الصيني: نسخة مختصرة بالماندرين لمنشورات المكتب الصيني شهرياً، وتوزيعها عبر شركاء المكتب على منصات صينية.</w:t>
-      </w:r>
-    </w:p>
-    <w:p>
-      <w:pPr>
-        <w:pStyle w:val="BodyText"/>
+    </w:p>
+    <w:p>
+      <w:pPr>
+        <w:numPr>
+          <w:ilvl w:val="0"/>
+          <w:numId w:val="1012"/>
+        </w:numPr>
+        <w:pStyle w:val="Compact"/>
+        <w:bidi/>
+        <w:jc w:val="right"/>
+      </w:pPr>
+      <w:r>
+        <w:t xml:space="preserve">استهداف مباشر (Sales Navigator) من فريق تطوير الأعمال لمديري الشؤون القانونية والمديرين الماليين والمؤسسين؛ التسويق يوفّر المحتوى الداعم (رسائل متابعة، أدلة، دعوات ندوات).</w:t>
+      </w:r>
+    </w:p>
+    <w:p>
+      <w:pPr>
+        <w:numPr>
+          <w:ilvl w:val="0"/>
+          <w:numId w:val="1012"/>
+        </w:numPr>
+        <w:pStyle w:val="Compact"/>
+        <w:bidi/>
+        <w:jc w:val="right"/>
+      </w:pPr>
+      <w:r>
+        <w:t xml:space="preserve">نماذج عملاء محتملين من خلال الندوات الإلكترونية (Webinars) المسجّلة على لينكدإن.</w:t>
+      </w:r>
+    </w:p>
+    <w:p>
+      <w:pPr>
+        <w:numPr>
+          <w:ilvl w:val="0"/>
+          <w:numId w:val="1012"/>
+        </w:numPr>
+        <w:pStyle w:val="Compact"/>
+        <w:bidi/>
+        <w:jc w:val="right"/>
+      </w:pPr>
+      <w:r>
+        <w:t xml:space="preserve">الاستجابة لكل تعليق من حساب مؤسسي أو حكومي بشكل شخصي.</w:t>
+      </w:r>
+    </w:p>
+    <w:p>
+      <w:pPr>
+        <w:numPr>
+          <w:ilvl w:val="0"/>
+          <w:numId w:val="1012"/>
+        </w:numPr>
+        <w:pStyle w:val="Compact"/>
+        <w:bidi/>
+        <w:jc w:val="right"/>
+      </w:pPr>
+      <w:r>
+        <w:t xml:space="preserve">المحتوى الصيني: نسخة مختصرة بالماندرين لمنشورات المكتب الصيني شهرياً، وتوزيعها عبر شركاء المكتب على منصات صينية.</w:t>
+      </w:r>
+    </w:p>
+    <w:p>
+      <w:pPr>
+        <w:pStyle w:val="FirstParagraph"/>
         <w:bidi/>
         <w:jc w:val="right"/>
       </w:pPr>
@@ -5105,15 +5281,17 @@
       <w:r>
         <w:t xml:space="preserve">ملخص هنا، والتفاصيل الكاملة في القسم 6.</w:t>
       </w:r>
-      <w:r>
-        <w:t xml:space="preserve"> </w:t>
-      </w:r>
-      <w:r>
-        <w:t xml:space="preserve">-</w:t>
-      </w:r>
-      <w:r>
-        <w:t xml:space="preserve"> </w:t>
-      </w:r>
+    </w:p>
+    <w:p>
+      <w:pPr>
+        <w:numPr>
+          <w:ilvl w:val="0"/>
+          <w:numId w:val="1013"/>
+        </w:numPr>
+        <w:pStyle w:val="Compact"/>
+        <w:bidi/>
+        <w:jc w:val="right"/>
+      </w:pPr>
       <w:r>
         <w:rPr>
           <w:bCs/>
@@ -5127,15 +5305,17 @@
       <w:r>
         <w:t xml:space="preserve">الظهور الأول للكلمات المفتاحية القانونية بالعربية والإنجليزية.</w:t>
       </w:r>
-      <w:r>
-        <w:t xml:space="preserve"> </w:t>
-      </w:r>
-      <w:r>
-        <w:t xml:space="preserve">-</w:t>
-      </w:r>
-      <w:r>
-        <w:t xml:space="preserve"> </w:t>
-      </w:r>
+    </w:p>
+    <w:p>
+      <w:pPr>
+        <w:numPr>
+          <w:ilvl w:val="0"/>
+          <w:numId w:val="1013"/>
+        </w:numPr>
+        <w:pStyle w:val="Compact"/>
+        <w:bidi/>
+        <w:jc w:val="right"/>
+      </w:pPr>
       <w:r>
         <w:rPr>
           <w:bCs/>
@@ -5149,15 +5329,17 @@
       <w:r>
         <w:t xml:space="preserve">معلومات كاملة، صور، منشورات أسبوعية، أسئلة وأجوبة، تقييمات موثقة ≥ 4.8.</w:t>
       </w:r>
-      <w:r>
-        <w:t xml:space="preserve"> </w:t>
-      </w:r>
-      <w:r>
-        <w:t xml:space="preserve">-</w:t>
-      </w:r>
-      <w:r>
-        <w:t xml:space="preserve"> </w:t>
-      </w:r>
+    </w:p>
+    <w:p>
+      <w:pPr>
+        <w:numPr>
+          <w:ilvl w:val="0"/>
+          <w:numId w:val="1013"/>
+        </w:numPr>
+        <w:pStyle w:val="Compact"/>
+        <w:bidi/>
+        <w:jc w:val="right"/>
+      </w:pPr>
       <w:r>
         <w:rPr>
           <w:bCs/>
@@ -5171,15 +5353,17 @@
       <w:r>
         <w:t xml:space="preserve">عبر الاتساق في البيانات على كل المنصات، والمقالات الصحفية، وويكي داتا، وترميز البيانات المنظّمة (Schema).</w:t>
       </w:r>
-      <w:r>
-        <w:t xml:space="preserve"> </w:t>
-      </w:r>
-      <w:r>
-        <w:t xml:space="preserve">-</w:t>
-      </w:r>
-      <w:r>
-        <w:t xml:space="preserve"> </w:t>
-      </w:r>
+    </w:p>
+    <w:p>
+      <w:pPr>
+        <w:numPr>
+          <w:ilvl w:val="0"/>
+          <w:numId w:val="1013"/>
+        </w:numPr>
+        <w:pStyle w:val="Compact"/>
+        <w:bidi/>
+        <w:jc w:val="right"/>
+      </w:pPr>
       <w:r>
         <w:rPr>
           <w:bCs/>
@@ -5193,15 +5377,17 @@
       <w:r>
         <w:t xml:space="preserve">عبر النشر الصحفي المنتظم والشراكات مع المنافذ الإخبارية.</w:t>
       </w:r>
-      <w:r>
-        <w:t xml:space="preserve"> </w:t>
-      </w:r>
-      <w:r>
-        <w:t xml:space="preserve">-</w:t>
-      </w:r>
-      <w:r>
-        <w:t xml:space="preserve"> </w:t>
-      </w:r>
+    </w:p>
+    <w:p>
+      <w:pPr>
+        <w:numPr>
+          <w:ilvl w:val="0"/>
+          <w:numId w:val="1013"/>
+        </w:numPr>
+        <w:pStyle w:val="Compact"/>
+        <w:bidi/>
+        <w:jc w:val="right"/>
+      </w:pPr>
       <w:r>
         <w:rPr>
           <w:bCs/>
@@ -5242,15 +5428,17 @@
       <w:r>
         <w:t xml:space="preserve">) بميزانية محكومة بتكلفة العميل المحتمل.</w:t>
       </w:r>
-      <w:r>
-        <w:t xml:space="preserve"> </w:t>
-      </w:r>
-      <w:r>
-        <w:t xml:space="preserve">-</w:t>
-      </w:r>
-      <w:r>
-        <w:t xml:space="preserve"> </w:t>
-      </w:r>
+    </w:p>
+    <w:p>
+      <w:pPr>
+        <w:numPr>
+          <w:ilvl w:val="0"/>
+          <w:numId w:val="1013"/>
+        </w:numPr>
+        <w:pStyle w:val="Compact"/>
+        <w:bidi/>
+        <w:jc w:val="right"/>
+      </w:pPr>
       <w:r>
         <w:rPr>
           <w:bCs/>
@@ -5310,88 +5498,144 @@
         </w:rPr>
         <w:t xml:space="preserve">المتطلبات في الربع الأول:</w:t>
       </w:r>
+    </w:p>
+    <w:p>
+      <w:pPr>
+        <w:numPr>
+          <w:ilvl w:val="0"/>
+          <w:numId w:val="1014"/>
+        </w:numPr>
+        <w:pStyle w:val="Compact"/>
+        <w:bidi/>
+        <w:jc w:val="right"/>
+      </w:pPr>
+      <w:r>
+        <w:t xml:space="preserve">بنية صفحات واضحة: الرئيسية، عن المكتب والهيكل المؤسسي، الفريق (صفحة لكل مستشار)، الخدمات (صفحة لكل خدمة بالعربية والإنجليزية، مع نسخة صينية للخدمات المرتبطة بالمكتب الصيني)، المدونة/المركز المعرفي، الإعلام والظهور، تواصل معنا.</w:t>
+      </w:r>
+    </w:p>
+    <w:p>
+      <w:pPr>
+        <w:numPr>
+          <w:ilvl w:val="0"/>
+          <w:numId w:val="1014"/>
+        </w:numPr>
+        <w:pStyle w:val="Compact"/>
+        <w:bidi/>
+        <w:jc w:val="right"/>
+      </w:pPr>
+      <w:r>
+        <w:t xml:space="preserve">صفحات هبوط لكل حملة (Landing Pages) بنموذج قصير + زر واتساب + زر اتصال.</w:t>
+      </w:r>
+    </w:p>
+    <w:p>
+      <w:pPr>
+        <w:numPr>
+          <w:ilvl w:val="0"/>
+          <w:numId w:val="1014"/>
+        </w:numPr>
+        <w:pStyle w:val="Compact"/>
+        <w:bidi/>
+        <w:jc w:val="right"/>
+      </w:pPr>
+      <w:r>
+        <w:t xml:space="preserve">تكامل تلقائي: كل نموذج ← نظام CRM ← إشعار فوري لمنسّق جذب العملاء ومساعد تطوير الأعمال.</w:t>
+      </w:r>
+    </w:p>
+    <w:p>
+      <w:pPr>
+        <w:numPr>
+          <w:ilvl w:val="0"/>
+          <w:numId w:val="1014"/>
+        </w:numPr>
+        <w:pStyle w:val="Compact"/>
+        <w:bidi/>
+        <w:jc w:val="right"/>
+      </w:pPr>
+      <w:r>
+        <w:t xml:space="preserve">سرعة تحميل أقل من 3 ثوانٍ على الجوال، وشهادة أمان، وتوافق كامل مع الجوال.</w:t>
+      </w:r>
+    </w:p>
+    <w:p>
+      <w:pPr>
+        <w:numPr>
+          <w:ilvl w:val="0"/>
+          <w:numId w:val="1014"/>
+        </w:numPr>
+        <w:pStyle w:val="Compact"/>
+        <w:bidi/>
+        <w:jc w:val="right"/>
+      </w:pPr>
+      <w:r>
+        <w:t xml:space="preserve">نظام حجز استشارة أولية (تقويم مدمج).</w:t>
+      </w:r>
+    </w:p>
+    <w:p>
+      <w:pPr>
+        <w:numPr>
+          <w:ilvl w:val="0"/>
+          <w:numId w:val="1014"/>
+        </w:numPr>
+        <w:pStyle w:val="Compact"/>
+        <w:bidi/>
+        <w:jc w:val="right"/>
+      </w:pPr>
+      <w:r>
+        <w:t xml:space="preserve">صفحة</w:t>
+      </w:r>
       <w:r>
         <w:t xml:space="preserve"> </w:t>
       </w:r>
       <w:r>
-        <w:t xml:space="preserve">- بنية صفحات واضحة: الرئيسية، عن المكتب والهيكل المؤسسي، الفريق (صفحة لكل مستشار)، الخدمات (صفحة لكل خدمة بالعربية والإنجليزية، مع نسخة صينية للخدمات المرتبطة بالمكتب الصيني)، المدونة/المركز المعرفي، الإعلام والظهور، تواصل معنا.</w:t>
+        <w:t xml:space="preserve">“</w:t>
+      </w:r>
+      <w:r>
+        <w:t xml:space="preserve">رصد التشريعات</w:t>
+      </w:r>
+      <w:r>
+        <w:t xml:space="preserve">”</w:t>
       </w:r>
       <w:r>
         <w:t xml:space="preserve"> </w:t>
       </w:r>
       <w:r>
-        <w:t xml:space="preserve">- صفحات هبوط لكل حملة (Landing Pages) بنموذج قصير + زر واتساب + زر اتصال.</w:t>
+        <w:t xml:space="preserve">محدثة باستمرار (تصبح مرجعاً يُستشهد به ويجلب روابط خلفية).</w:t>
+      </w:r>
+    </w:p>
+    <w:p>
+      <w:pPr>
+        <w:numPr>
+          <w:ilvl w:val="0"/>
+          <w:numId w:val="1014"/>
+        </w:numPr>
+        <w:pStyle w:val="Compact"/>
+        <w:bidi/>
+        <w:jc w:val="right"/>
+      </w:pPr>
+      <w:r>
+        <w:t xml:space="preserve">أرشيف</w:t>
       </w:r>
       <w:r>
         <w:t xml:space="preserve"> </w:t>
       </w:r>
       <w:r>
-        <w:t xml:space="preserve">- تكامل تلقائي: كل نموذج ← نظام CRM ← إشعار فوري لمنسّق جذب العملاء ومساعد تطوير الأعمال.</w:t>
+        <w:t xml:space="preserve">“</w:t>
+      </w:r>
+      <w:r>
+        <w:t xml:space="preserve">د. راشد في الإعلام</w:t>
+      </w:r>
+      <w:r>
+        <w:t xml:space="preserve">”</w:t>
       </w:r>
       <w:r>
         <w:t xml:space="preserve"> </w:t>
       </w:r>
       <w:r>
-        <w:t xml:space="preserve">- سرعة تحميل أقل من 3 ثوانٍ على الجوال، وشهادة أمان، وتوافق كامل مع الجوال.</w:t>
-      </w:r>
-      <w:r>
-        <w:t xml:space="preserve"> </w:t>
-      </w:r>
-      <w:r>
-        <w:t xml:space="preserve">- نظام حجز استشارة أولية (تقويم مدمج).</w:t>
-      </w:r>
-      <w:r>
-        <w:t xml:space="preserve"> </w:t>
-      </w:r>
-      <w:r>
-        <w:t xml:space="preserve">- صفحة</w:t>
-      </w:r>
-      <w:r>
-        <w:t xml:space="preserve"> </w:t>
-      </w:r>
-      <w:r>
-        <w:t xml:space="preserve">“</w:t>
-      </w:r>
-      <w:r>
-        <w:t xml:space="preserve">رصد التشريعات</w:t>
-      </w:r>
-      <w:r>
-        <w:t xml:space="preserve">”</w:t>
-      </w:r>
-      <w:r>
-        <w:t xml:space="preserve"> </w:t>
-      </w:r>
-      <w:r>
-        <w:t xml:space="preserve">محدثة باستمرار (تصبح مرجعاً يُستشهد به ويجلب روابط خلفية).</w:t>
-      </w:r>
-      <w:r>
-        <w:t xml:space="preserve"> </w:t>
-      </w:r>
-      <w:r>
-        <w:t xml:space="preserve">- أرشيف</w:t>
-      </w:r>
-      <w:r>
-        <w:t xml:space="preserve"> </w:t>
-      </w:r>
-      <w:r>
-        <w:t xml:space="preserve">“</w:t>
-      </w:r>
-      <w:r>
-        <w:t xml:space="preserve">د. راشد في الإعلام</w:t>
-      </w:r>
-      <w:r>
-        <w:t xml:space="preserve">”</w:t>
-      </w:r>
-      <w:r>
-        <w:t xml:space="preserve"> </w:t>
-      </w:r>
-      <w:r>
         <w:t xml:space="preserve">يجمع كل الظهور الخارجي.</w:t>
       </w:r>
     </w:p>
     <w:p>
       <w:pPr>
-        <w:pStyle w:val="BodyText"/>
+        <w:pStyle w:val="FirstParagraph"/>
         <w:bidi/>
         <w:jc w:val="right"/>
       </w:pPr>
@@ -5425,7 +5669,7 @@
       <w:pPr>
         <w:numPr>
           <w:ilvl w:val="0"/>
-          <w:numId w:val="1007"/>
+          <w:numId w:val="1015"/>
         </w:numPr>
         <w:pStyle w:val="Compact"/>
         <w:bidi/>
@@ -5449,7 +5693,7 @@
       <w:pPr>
         <w:numPr>
           <w:ilvl w:val="0"/>
-          <w:numId w:val="1007"/>
+          <w:numId w:val="1015"/>
         </w:numPr>
         <w:pStyle w:val="Compact"/>
         <w:bidi/>
@@ -5550,7 +5794,7 @@
       <w:pPr>
         <w:numPr>
           <w:ilvl w:val="0"/>
-          <w:numId w:val="1007"/>
+          <w:numId w:val="1015"/>
         </w:numPr>
         <w:pStyle w:val="Compact"/>
         <w:bidi/>
@@ -5586,7 +5830,7 @@
       <w:pPr>
         <w:numPr>
           <w:ilvl w:val="0"/>
-          <w:numId w:val="1008"/>
+          <w:numId w:val="1016"/>
         </w:numPr>
         <w:pStyle w:val="Compact"/>
         <w:bidi/>
@@ -5600,7 +5844,7 @@
       <w:pPr>
         <w:numPr>
           <w:ilvl w:val="0"/>
-          <w:numId w:val="1008"/>
+          <w:numId w:val="1016"/>
         </w:numPr>
         <w:pStyle w:val="Compact"/>
         <w:bidi/>
@@ -5614,7 +5858,7 @@
       <w:pPr>
         <w:numPr>
           <w:ilvl w:val="0"/>
-          <w:numId w:val="1008"/>
+          <w:numId w:val="1016"/>
         </w:numPr>
         <w:pStyle w:val="Compact"/>
         <w:bidi/>
@@ -5663,7 +5907,7 @@
       <w:pPr>
         <w:numPr>
           <w:ilvl w:val="0"/>
-          <w:numId w:val="1009"/>
+          <w:numId w:val="1017"/>
         </w:numPr>
         <w:pStyle w:val="Compact"/>
         <w:bidi/>
@@ -5687,7 +5931,7 @@
       <w:pPr>
         <w:numPr>
           <w:ilvl w:val="0"/>
-          <w:numId w:val="1009"/>
+          <w:numId w:val="1017"/>
         </w:numPr>
         <w:pStyle w:val="Compact"/>
         <w:bidi/>
@@ -5711,7 +5955,7 @@
       <w:pPr>
         <w:numPr>
           <w:ilvl w:val="0"/>
-          <w:numId w:val="1009"/>
+          <w:numId w:val="1017"/>
         </w:numPr>
         <w:pStyle w:val="Compact"/>
         <w:bidi/>
@@ -5735,7 +5979,7 @@
       <w:pPr>
         <w:numPr>
           <w:ilvl w:val="0"/>
-          <w:numId w:val="1009"/>
+          <w:numId w:val="1017"/>
         </w:numPr>
         <w:pStyle w:val="Compact"/>
         <w:bidi/>
@@ -5759,7 +6003,7 @@
       <w:pPr>
         <w:numPr>
           <w:ilvl w:val="0"/>
-          <w:numId w:val="1009"/>
+          <w:numId w:val="1017"/>
         </w:numPr>
         <w:pStyle w:val="Compact"/>
         <w:bidi/>
@@ -6161,7 +6405,7 @@
       <w:pPr>
         <w:numPr>
           <w:ilvl w:val="0"/>
-          <w:numId w:val="1010"/>
+          <w:numId w:val="1018"/>
         </w:numPr>
         <w:pStyle w:val="Compact"/>
         <w:bidi/>
@@ -6185,7 +6429,7 @@
       <w:pPr>
         <w:numPr>
           <w:ilvl w:val="0"/>
-          <w:numId w:val="1010"/>
+          <w:numId w:val="1018"/>
         </w:numPr>
         <w:pStyle w:val="Compact"/>
         <w:bidi/>
@@ -6209,7 +6453,7 @@
       <w:pPr>
         <w:numPr>
           <w:ilvl w:val="0"/>
-          <w:numId w:val="1010"/>
+          <w:numId w:val="1018"/>
         </w:numPr>
         <w:pStyle w:val="Compact"/>
         <w:bidi/>
@@ -6233,7 +6477,7 @@
       <w:pPr>
         <w:numPr>
           <w:ilvl w:val="0"/>
-          <w:numId w:val="1010"/>
+          <w:numId w:val="1018"/>
         </w:numPr>
         <w:pStyle w:val="Compact"/>
         <w:bidi/>
@@ -6257,7 +6501,7 @@
       <w:pPr>
         <w:numPr>
           <w:ilvl w:val="0"/>
-          <w:numId w:val="1010"/>
+          <w:numId w:val="1018"/>
         </w:numPr>
         <w:pStyle w:val="Compact"/>
         <w:bidi/>
@@ -6293,7 +6537,7 @@
       <w:pPr>
         <w:numPr>
           <w:ilvl w:val="0"/>
-          <w:numId w:val="1011"/>
+          <w:numId w:val="1019"/>
         </w:numPr>
         <w:pStyle w:val="Compact"/>
         <w:bidi/>
@@ -6317,7 +6561,7 @@
       <w:pPr>
         <w:numPr>
           <w:ilvl w:val="0"/>
-          <w:numId w:val="1011"/>
+          <w:numId w:val="1019"/>
         </w:numPr>
         <w:pStyle w:val="Compact"/>
         <w:bidi/>
@@ -6341,7 +6585,7 @@
       <w:pPr>
         <w:numPr>
           <w:ilvl w:val="0"/>
-          <w:numId w:val="1011"/>
+          <w:numId w:val="1019"/>
         </w:numPr>
         <w:pStyle w:val="Compact"/>
         <w:bidi/>
@@ -6365,7 +6609,7 @@
       <w:pPr>
         <w:numPr>
           <w:ilvl w:val="0"/>
-          <w:numId w:val="1011"/>
+          <w:numId w:val="1019"/>
         </w:numPr>
         <w:pStyle w:val="Compact"/>
         <w:bidi/>
@@ -6389,7 +6633,7 @@
       <w:pPr>
         <w:numPr>
           <w:ilvl w:val="0"/>
-          <w:numId w:val="1011"/>
+          <w:numId w:val="1019"/>
         </w:numPr>
         <w:pStyle w:val="Compact"/>
         <w:bidi/>
@@ -7574,7 +7818,7 @@
       <w:pPr>
         <w:numPr>
           <w:ilvl w:val="0"/>
-          <w:numId w:val="1012"/>
+          <w:numId w:val="1020"/>
         </w:numPr>
         <w:pStyle w:val="Compact"/>
         <w:bidi/>
@@ -7598,7 +7842,7 @@
       <w:pPr>
         <w:numPr>
           <w:ilvl w:val="0"/>
-          <w:numId w:val="1012"/>
+          <w:numId w:val="1020"/>
         </w:numPr>
         <w:pStyle w:val="Compact"/>
         <w:bidi/>
@@ -7622,7 +7866,7 @@
       <w:pPr>
         <w:numPr>
           <w:ilvl w:val="0"/>
-          <w:numId w:val="1012"/>
+          <w:numId w:val="1020"/>
         </w:numPr>
         <w:pStyle w:val="Compact"/>
         <w:bidi/>
@@ -7702,70 +7946,126 @@
         </w:rPr>
         <w:t xml:space="preserve">الأهداف:</w:t>
       </w:r>
+    </w:p>
+    <w:p>
+      <w:pPr>
+        <w:numPr>
+          <w:ilvl w:val="0"/>
+          <w:numId w:val="1021"/>
+        </w:numPr>
+        <w:pStyle w:val="Compact"/>
+        <w:bidi/>
+        <w:jc w:val="right"/>
+      </w:pPr>
+      <w:r>
+        <w:t xml:space="preserve">تعيين مدير التسويق والمبيعات وتشكيل الفريق.</w:t>
+      </w:r>
+    </w:p>
+    <w:p>
+      <w:pPr>
+        <w:numPr>
+          <w:ilvl w:val="0"/>
+          <w:numId w:val="1021"/>
+        </w:numPr>
+        <w:pStyle w:val="Compact"/>
+        <w:bidi/>
+        <w:jc w:val="right"/>
+      </w:pPr>
+      <w:r>
+        <w:t xml:space="preserve">اعتماد دليل الهوية والنبرة وقوالب التصميم.</w:t>
+      </w:r>
+    </w:p>
+    <w:p>
+      <w:pPr>
+        <w:numPr>
+          <w:ilvl w:val="0"/>
+          <w:numId w:val="1021"/>
+        </w:numPr>
+        <w:pStyle w:val="Compact"/>
+        <w:bidi/>
+        <w:jc w:val="right"/>
+      </w:pPr>
+      <w:r>
+        <w:t xml:space="preserve">إطلاق الموقع المحسّن (أو نسخة مطوّرة) مع صفحات الهبوط وتكامل CRM.</w:t>
+      </w:r>
+    </w:p>
+    <w:p>
+      <w:pPr>
+        <w:numPr>
+          <w:ilvl w:val="0"/>
+          <w:numId w:val="1021"/>
+        </w:numPr>
+        <w:pStyle w:val="Compact"/>
+        <w:bidi/>
+        <w:jc w:val="right"/>
+      </w:pPr>
+      <w:r>
+        <w:t xml:space="preserve">تدقيق SEO الفني وإصلاح الأخطاء وبدء إنتاج المحتوى.</w:t>
+      </w:r>
+    </w:p>
+    <w:p>
+      <w:pPr>
+        <w:numPr>
+          <w:ilvl w:val="0"/>
+          <w:numId w:val="1021"/>
+        </w:numPr>
+        <w:pStyle w:val="Compact"/>
+        <w:bidi/>
+        <w:jc w:val="right"/>
+      </w:pPr>
+      <w:r>
+        <w:t xml:space="preserve">تفعيل كل الحسابات بهوية موحّدة وجدول نشر منتظم.</w:t>
+      </w:r>
+    </w:p>
+    <w:p>
+      <w:pPr>
+        <w:numPr>
+          <w:ilvl w:val="0"/>
+          <w:numId w:val="1021"/>
+        </w:numPr>
+        <w:pStyle w:val="Compact"/>
+        <w:bidi/>
+        <w:jc w:val="right"/>
+      </w:pPr>
+      <w:r>
+        <w:t xml:space="preserve">إطلاق</w:t>
+      </w:r>
       <w:r>
         <w:t xml:space="preserve"> </w:t>
       </w:r>
       <w:r>
-        <w:t xml:space="preserve">- تعيين مدير التسويق والمبيعات وتشكيل الفريق.</w:t>
+        <w:t xml:space="preserve">“</w:t>
+      </w:r>
+      <w:r>
+        <w:t xml:space="preserve">الرصد التشريعي</w:t>
+      </w:r>
+      <w:r>
+        <w:t xml:space="preserve">”</w:t>
       </w:r>
       <w:r>
         <w:t xml:space="preserve"> </w:t>
       </w:r>
       <w:r>
-        <w:t xml:space="preserve">- اعتماد دليل الهوية والنبرة وقوالب التصميم.</w:t>
-      </w:r>
-      <w:r>
-        <w:t xml:space="preserve"> </w:t>
-      </w:r>
-      <w:r>
-        <w:t xml:space="preserve">- إطلاق الموقع المحسّن (أو نسخة مطوّرة) مع صفحات الهبوط وتكامل CRM.</w:t>
-      </w:r>
-      <w:r>
-        <w:t xml:space="preserve"> </w:t>
-      </w:r>
-      <w:r>
-        <w:t xml:space="preserve">- تدقيق SEO الفني وإصلاح الأخطاء وبدء إنتاج المحتوى.</w:t>
-      </w:r>
-      <w:r>
-        <w:t xml:space="preserve"> </w:t>
-      </w:r>
-      <w:r>
-        <w:t xml:space="preserve">- تفعيل كل الحسابات بهوية موحّدة وجدول نشر منتظم.</w:t>
-      </w:r>
-      <w:r>
-        <w:t xml:space="preserve"> </w:t>
-      </w:r>
-      <w:r>
-        <w:t xml:space="preserve">- إطلاق</w:t>
-      </w:r>
-      <w:r>
-        <w:t xml:space="preserve"> </w:t>
-      </w:r>
-      <w:r>
-        <w:t xml:space="preserve">“</w:t>
-      </w:r>
-      <w:r>
-        <w:t xml:space="preserve">الرصد التشريعي</w:t>
-      </w:r>
-      <w:r>
-        <w:t xml:space="preserve">”</w:t>
-      </w:r>
-      <w:r>
-        <w:t xml:space="preserve"> </w:t>
-      </w:r>
-      <w:r>
         <w:t xml:space="preserve">على X بحساب د. راشد.</w:t>
       </w:r>
-      <w:r>
-        <w:t xml:space="preserve"> </w:t>
-      </w:r>
-      <w:r>
-        <w:t xml:space="preserve">- تشغيل مسار العملاء المحتملين من الاستلام إلى CRM باتفاقية مستوى خدمة.</w:t>
-      </w:r>
-    </w:p>
-    <w:p>
-      <w:pPr>
-        <w:pStyle w:val="BodyText"/>
+    </w:p>
+    <w:p>
+      <w:pPr>
+        <w:numPr>
+          <w:ilvl w:val="0"/>
+          <w:numId w:val="1021"/>
+        </w:numPr>
+        <w:pStyle w:val="Compact"/>
+        <w:bidi/>
+        <w:jc w:val="right"/>
+      </w:pPr>
+      <w:r>
+        <w:t xml:space="preserve">تشغيل مسار العملاء المحتملين من الاستلام إلى CRM باتفاقية مستوى خدمة.</w:t>
+      </w:r>
+    </w:p>
+    <w:p>
+      <w:pPr>
+        <w:pStyle w:val="FirstParagraph"/>
         <w:bidi/>
         <w:jc w:val="right"/>
       </w:pPr>
@@ -7776,52 +8076,108 @@
         </w:rPr>
         <w:t xml:space="preserve">المخرجات الرئيسية:</w:t>
       </w:r>
-      <w:r>
-        <w:t xml:space="preserve"> </w:t>
-      </w:r>
-      <w:r>
-        <w:t xml:space="preserve">- دليل هوية + دليل نبرة + 12 قالب تصميم.</w:t>
-      </w:r>
-      <w:r>
-        <w:t xml:space="preserve"> </w:t>
-      </w:r>
-      <w:r>
-        <w:t xml:space="preserve">- تقويم محتوى للربع كامل.</w:t>
-      </w:r>
-      <w:r>
-        <w:t xml:space="preserve"> </w:t>
-      </w:r>
-      <w:r>
-        <w:t xml:space="preserve">- 24+ منشوراً أسبوعياً عبر المنصات (بدء من 3 أسبوعياً لكل منصة والتصاعد).</w:t>
-      </w:r>
-      <w:r>
-        <w:t xml:space="preserve"> </w:t>
-      </w:r>
-      <w:r>
-        <w:t xml:space="preserve">- 8 مقالات SEO + 4 صفحات خدمة.</w:t>
-      </w:r>
-      <w:r>
-        <w:t xml:space="preserve"> </w:t>
-      </w:r>
-      <w:r>
-        <w:t xml:space="preserve">- أول ندوة إلكترونية (الشهر 3) + أول حلقتين بودكاست (الشهر 3).</w:t>
-      </w:r>
-      <w:r>
-        <w:t xml:space="preserve"> </w:t>
-      </w:r>
-      <w:r>
-        <w:t xml:space="preserve">- أول 4 ظهورات إعلامية خارجية.</w:t>
-      </w:r>
-      <w:r>
-        <w:t xml:space="preserve"> </w:t>
-      </w:r>
-      <w:r>
-        <w:t xml:space="preserve">- لوحة مؤشرات أسبوعية فعّالة.</w:t>
-      </w:r>
-    </w:p>
-    <w:p>
-      <w:pPr>
-        <w:pStyle w:val="BodyText"/>
+    </w:p>
+    <w:p>
+      <w:pPr>
+        <w:numPr>
+          <w:ilvl w:val="0"/>
+          <w:numId w:val="1022"/>
+        </w:numPr>
+        <w:pStyle w:val="Compact"/>
+        <w:bidi/>
+        <w:jc w:val="right"/>
+      </w:pPr>
+      <w:r>
+        <w:t xml:space="preserve">دليل هوية + دليل نبرة + 12 قالب تصميم.</w:t>
+      </w:r>
+    </w:p>
+    <w:p>
+      <w:pPr>
+        <w:numPr>
+          <w:ilvl w:val="0"/>
+          <w:numId w:val="1022"/>
+        </w:numPr>
+        <w:pStyle w:val="Compact"/>
+        <w:bidi/>
+        <w:jc w:val="right"/>
+      </w:pPr>
+      <w:r>
+        <w:t xml:space="preserve">تقويم محتوى للربع كامل.</w:t>
+      </w:r>
+    </w:p>
+    <w:p>
+      <w:pPr>
+        <w:numPr>
+          <w:ilvl w:val="0"/>
+          <w:numId w:val="1022"/>
+        </w:numPr>
+        <w:pStyle w:val="Compact"/>
+        <w:bidi/>
+        <w:jc w:val="right"/>
+      </w:pPr>
+      <w:r>
+        <w:t xml:space="preserve">24+ منشوراً أسبوعياً عبر المنصات (بدء من 3 أسبوعياً لكل منصة والتصاعد).</w:t>
+      </w:r>
+    </w:p>
+    <w:p>
+      <w:pPr>
+        <w:numPr>
+          <w:ilvl w:val="0"/>
+          <w:numId w:val="1022"/>
+        </w:numPr>
+        <w:pStyle w:val="Compact"/>
+        <w:bidi/>
+        <w:jc w:val="right"/>
+      </w:pPr>
+      <w:r>
+        <w:t xml:space="preserve">8 مقالات SEO + 4 صفحات خدمة.</w:t>
+      </w:r>
+    </w:p>
+    <w:p>
+      <w:pPr>
+        <w:numPr>
+          <w:ilvl w:val="0"/>
+          <w:numId w:val="1022"/>
+        </w:numPr>
+        <w:pStyle w:val="Compact"/>
+        <w:bidi/>
+        <w:jc w:val="right"/>
+      </w:pPr>
+      <w:r>
+        <w:t xml:space="preserve">أول ندوة إلكترونية (الشهر 3) + أول حلقتين بودكاست (الشهر 3).</w:t>
+      </w:r>
+    </w:p>
+    <w:p>
+      <w:pPr>
+        <w:numPr>
+          <w:ilvl w:val="0"/>
+          <w:numId w:val="1022"/>
+        </w:numPr>
+        <w:pStyle w:val="Compact"/>
+        <w:bidi/>
+        <w:jc w:val="right"/>
+      </w:pPr>
+      <w:r>
+        <w:t xml:space="preserve">أول 4 ظهورات إعلامية خارجية.</w:t>
+      </w:r>
+    </w:p>
+    <w:p>
+      <w:pPr>
+        <w:numPr>
+          <w:ilvl w:val="0"/>
+          <w:numId w:val="1022"/>
+        </w:numPr>
+        <w:pStyle w:val="Compact"/>
+        <w:bidi/>
+        <w:jc w:val="right"/>
+      </w:pPr>
+      <w:r>
+        <w:t xml:space="preserve">لوحة مؤشرات أسبوعية فعّالة.</w:t>
+      </w:r>
+    </w:p>
+    <w:p>
+      <w:pPr>
+        <w:pStyle w:val="FirstParagraph"/>
         <w:bidi/>
         <w:jc w:val="right"/>
       </w:pPr>
@@ -7876,28 +8232,52 @@
         </w:rPr>
         <w:t xml:space="preserve">الأهداف:</w:t>
       </w:r>
+    </w:p>
+    <w:p>
+      <w:pPr>
+        <w:numPr>
+          <w:ilvl w:val="0"/>
+          <w:numId w:val="1023"/>
+        </w:numPr>
+        <w:pStyle w:val="Compact"/>
+        <w:bidi/>
+        <w:jc w:val="right"/>
+      </w:pPr>
+      <w:r>
+        <w:t xml:space="preserve">رفع حجم الإنتاج إلى الحجم الكامل (الجدول 7.1).</w:t>
+      </w:r>
+    </w:p>
+    <w:p>
+      <w:pPr>
+        <w:numPr>
+          <w:ilvl w:val="0"/>
+          <w:numId w:val="1023"/>
+        </w:numPr>
+        <w:pStyle w:val="Compact"/>
+        <w:bidi/>
+        <w:jc w:val="right"/>
+      </w:pPr>
+      <w:r>
+        <w:t xml:space="preserve">إطلاق الإعلانات المدفوعة على فيسبوك وإنستغرام وجوجل بتجارب مضبوطة (A/B) على 3 خدمات أعلى هامشاً.</w:t>
+      </w:r>
+    </w:p>
+    <w:p>
+      <w:pPr>
+        <w:numPr>
+          <w:ilvl w:val="0"/>
+          <w:numId w:val="1023"/>
+        </w:numPr>
+        <w:pStyle w:val="Compact"/>
+        <w:bidi/>
+        <w:jc w:val="right"/>
+      </w:pPr>
+      <w:r>
+        <w:t xml:space="preserve">إطلاق نشرة لينكدإن الشهرية وبرنامج</w:t>
+      </w:r>
       <w:r>
         <w:t xml:space="preserve"> </w:t>
       </w:r>
       <w:r>
-        <w:t xml:space="preserve">- رفع حجم الإنتاج إلى الحجم الكامل (الجدول 7.1).</w:t>
-      </w:r>
-      <w:r>
-        <w:t xml:space="preserve"> </w:t>
-      </w:r>
-      <w:r>
-        <w:t xml:space="preserve">- إطلاق الإعلانات المدفوعة على فيسبوك وإنستغرام وجوجل بتجارب مضبوطة (A/B) على 3 خدمات أعلى هامشاً.</w:t>
-      </w:r>
-      <w:r>
-        <w:t xml:space="preserve"> </w:t>
-      </w:r>
-      <w:r>
-        <w:t xml:space="preserve">- إطلاق نشرة لينكدإن الشهرية وبرنامج</w:t>
-      </w:r>
-      <w:r>
-        <w:t xml:space="preserve"> </w:t>
-      </w:r>
-      <w:r>
         <w:t xml:space="preserve">“</w:t>
       </w:r>
       <w:r>
@@ -7909,28 +8289,52 @@
       <w:r>
         <w:t xml:space="preserve">.</w:t>
       </w:r>
-      <w:r>
-        <w:t xml:space="preserve"> </w:t>
-      </w:r>
-      <w:r>
-        <w:t xml:space="preserve">- صفحات الإمارات المحلية وSEO المحلي.</w:t>
-      </w:r>
-      <w:r>
-        <w:t xml:space="preserve"> </w:t>
-      </w:r>
-      <w:r>
-        <w:t xml:space="preserve">- أول ورشة حضورية للشركات.</w:t>
-      </w:r>
-      <w:r>
-        <w:t xml:space="preserve"> </w:t>
-      </w:r>
-      <w:r>
-        <w:t xml:space="preserve">- محتوى المكتب الصيني بالماندرين (شهري).</w:t>
-      </w:r>
-    </w:p>
-    <w:p>
-      <w:pPr>
-        <w:pStyle w:val="BodyText"/>
+    </w:p>
+    <w:p>
+      <w:pPr>
+        <w:numPr>
+          <w:ilvl w:val="0"/>
+          <w:numId w:val="1023"/>
+        </w:numPr>
+        <w:pStyle w:val="Compact"/>
+        <w:bidi/>
+        <w:jc w:val="right"/>
+      </w:pPr>
+      <w:r>
+        <w:t xml:space="preserve">صفحات الإمارات المحلية وSEO المحلي.</w:t>
+      </w:r>
+    </w:p>
+    <w:p>
+      <w:pPr>
+        <w:numPr>
+          <w:ilvl w:val="0"/>
+          <w:numId w:val="1023"/>
+        </w:numPr>
+        <w:pStyle w:val="Compact"/>
+        <w:bidi/>
+        <w:jc w:val="right"/>
+      </w:pPr>
+      <w:r>
+        <w:t xml:space="preserve">أول ورشة حضورية للشركات.</w:t>
+      </w:r>
+    </w:p>
+    <w:p>
+      <w:pPr>
+        <w:numPr>
+          <w:ilvl w:val="0"/>
+          <w:numId w:val="1023"/>
+        </w:numPr>
+        <w:pStyle w:val="Compact"/>
+        <w:bidi/>
+        <w:jc w:val="right"/>
+      </w:pPr>
+      <w:r>
+        <w:t xml:space="preserve">محتوى المكتب الصيني بالماندرين (شهري).</w:t>
+      </w:r>
+    </w:p>
+    <w:p>
+      <w:pPr>
+        <w:pStyle w:val="FirstParagraph"/>
         <w:bidi/>
         <w:jc w:val="right"/>
       </w:pPr>
@@ -8005,58 +8409,98 @@
         </w:rPr>
         <w:t xml:space="preserve">الأهداف:</w:t>
       </w:r>
+    </w:p>
+    <w:p>
+      <w:pPr>
+        <w:numPr>
+          <w:ilvl w:val="0"/>
+          <w:numId w:val="1024"/>
+        </w:numPr>
+        <w:pStyle w:val="Compact"/>
+        <w:bidi/>
+        <w:jc w:val="right"/>
+      </w:pPr>
+      <w:r>
+        <w:t xml:space="preserve">تثبيت د. راشد الكيتوب كمصدر أول للتعليق التشريعي: شراكات مع منافذ إخبارية لعمود شهري، وظهور تلفزيوني/إذاعي شهري.</w:t>
+      </w:r>
+    </w:p>
+    <w:p>
+      <w:pPr>
+        <w:numPr>
+          <w:ilvl w:val="0"/>
+          <w:numId w:val="1024"/>
+        </w:numPr>
+        <w:pStyle w:val="Compact"/>
+        <w:bidi/>
+        <w:jc w:val="right"/>
+      </w:pPr>
+      <w:r>
+        <w:t xml:space="preserve">بودكاست المكتب يستضيف شخصيات ذات ثقل (رجال أعمال، مسؤولين سابقين، قانونيين).</w:t>
+      </w:r>
+    </w:p>
+    <w:p>
+      <w:pPr>
+        <w:numPr>
+          <w:ilvl w:val="0"/>
+          <w:numId w:val="1024"/>
+        </w:numPr>
+        <w:pStyle w:val="Compact"/>
+        <w:bidi/>
+        <w:jc w:val="right"/>
+      </w:pPr>
+      <w:r>
+        <w:t xml:space="preserve">حدث سنوي خاص بالمكتب (منتدى أو ملتقى قانوني) يُعلن عنه ويُنفَّذ في الربع الرابع.</w:t>
+      </w:r>
+    </w:p>
+    <w:p>
+      <w:pPr>
+        <w:numPr>
+          <w:ilvl w:val="0"/>
+          <w:numId w:val="1024"/>
+        </w:numPr>
+        <w:pStyle w:val="Compact"/>
+        <w:bidi/>
+        <w:jc w:val="right"/>
+      </w:pPr>
+      <w:r>
+        <w:t xml:space="preserve">إطلاق سلسلة</w:t>
+      </w:r>
       <w:r>
         <w:t xml:space="preserve"> </w:t>
       </w:r>
       <w:r>
-        <w:t xml:space="preserve">- تثبيت د. راشد الكيتوب كمصدر أول للتعليق التشريعي: شراكات مع منافذ إخبارية لعمود شهري، وظهور تلفزيوني/إذاعي شهري.</w:t>
+        <w:t xml:space="preserve">“</w:t>
+      </w:r>
+      <w:r>
+        <w:t xml:space="preserve">دليل الشركات</w:t>
+      </w:r>
+      <w:r>
+        <w:t xml:space="preserve">”</w:t>
       </w:r>
       <w:r>
         <w:t xml:space="preserve"> </w:t>
       </w:r>
       <w:r>
-        <w:t xml:space="preserve">- بودكاست المكتب يستضيف شخصيات ذات ثقل (رجال أعمال، مسؤولين سابقين، قانونيين).</w:t>
-      </w:r>
-      <w:r>
-        <w:t xml:space="preserve"> </w:t>
-      </w:r>
-      <w:r>
-        <w:t xml:space="preserve">- حدث سنوي خاص بالمكتب (منتدى أو ملتقى قانوني) يُعلن عنه ويُنفَّذ في الربع الرابع.</w:t>
-      </w:r>
-      <w:r>
-        <w:t xml:space="preserve"> </w:t>
-      </w:r>
-      <w:r>
-        <w:t xml:space="preserve">- إطلاق سلسلة</w:t>
-      </w:r>
-      <w:r>
-        <w:t xml:space="preserve"> </w:t>
-      </w:r>
-      <w:r>
-        <w:t xml:space="preserve">“</w:t>
-      </w:r>
-      <w:r>
-        <w:t xml:space="preserve">دليل الشركات</w:t>
-      </w:r>
-      <w:r>
-        <w:t xml:space="preserve">”</w:t>
-      </w:r>
-      <w:r>
-        <w:t xml:space="preserve"> </w:t>
-      </w:r>
-      <w:r>
         <w:t xml:space="preserve">(PDF) للتحميل مقابل البريد الإلكتروني.</w:t>
       </w:r>
-      <w:r>
-        <w:t xml:space="preserve"> </w:t>
-      </w:r>
-      <w:r>
-        <w:t xml:space="preserve">- توسيع SEO إلى المحتوى الإنجليزي بعمق + الأسئلة الشائعة.</w:t>
-      </w:r>
-    </w:p>
-    <w:p>
-      <w:pPr>
-        <w:pStyle w:val="BodyText"/>
+    </w:p>
+    <w:p>
+      <w:pPr>
+        <w:numPr>
+          <w:ilvl w:val="0"/>
+          <w:numId w:val="1024"/>
+        </w:numPr>
+        <w:pStyle w:val="Compact"/>
+        <w:bidi/>
+        <w:jc w:val="right"/>
+      </w:pPr>
+      <w:r>
+        <w:t xml:space="preserve">توسيع SEO إلى المحتوى الإنجليزي بعمق + الأسئلة الشائعة.</w:t>
+      </w:r>
+    </w:p>
+    <w:p>
+      <w:pPr>
+        <w:pStyle w:val="FirstParagraph"/>
         <w:bidi/>
         <w:jc w:val="right"/>
       </w:pPr>
@@ -8149,40 +8593,80 @@
         </w:rPr>
         <w:t xml:space="preserve">الأهداف:</w:t>
       </w:r>
-      <w:r>
-        <w:t xml:space="preserve"> </w:t>
-      </w:r>
-      <w:r>
-        <w:t xml:space="preserve">- تنفيذ الحدث السنوي (ملتقى/منتدى) بتغطية إعلامية كاملة وضيوف من الجهات والشركات.</w:t>
-      </w:r>
-      <w:r>
-        <w:t xml:space="preserve"> </w:t>
-      </w:r>
-      <w:r>
-        <w:t xml:space="preserve">- حملة اليوم الوطني وختام السنة بمحتوى مؤسسي عالي الجودة.</w:t>
-      </w:r>
-      <w:r>
-        <w:t xml:space="preserve"> </w:t>
-      </w:r>
-      <w:r>
-        <w:t xml:space="preserve">- جعل التعليق التشريعي للمؤسس يتصدر محادثة أي تشريع كبير خلال 24 ساعة (قياس عبر مرات الظهور والاقتباسات والترند).</w:t>
-      </w:r>
-      <w:r>
-        <w:t xml:space="preserve"> </w:t>
-      </w:r>
-      <w:r>
-        <w:t xml:space="preserve">- تقييم شامل للسنة وبناء خطة السنة التالية بناءً على البيانات.</w:t>
-      </w:r>
-      <w:r>
-        <w:t xml:space="preserve"> </w:t>
-      </w:r>
-      <w:r>
-        <w:t xml:space="preserve">- أتمتة ما أمكن (ردود، تأهيل، تقارير).</w:t>
-      </w:r>
-    </w:p>
-    <w:p>
-      <w:pPr>
-        <w:pStyle w:val="BodyText"/>
+    </w:p>
+    <w:p>
+      <w:pPr>
+        <w:numPr>
+          <w:ilvl w:val="0"/>
+          <w:numId w:val="1025"/>
+        </w:numPr>
+        <w:pStyle w:val="Compact"/>
+        <w:bidi/>
+        <w:jc w:val="right"/>
+      </w:pPr>
+      <w:r>
+        <w:t xml:space="preserve">تنفيذ الحدث السنوي (ملتقى/منتدى) بتغطية إعلامية كاملة وضيوف من الجهات والشركات.</w:t>
+      </w:r>
+    </w:p>
+    <w:p>
+      <w:pPr>
+        <w:numPr>
+          <w:ilvl w:val="0"/>
+          <w:numId w:val="1025"/>
+        </w:numPr>
+        <w:pStyle w:val="Compact"/>
+        <w:bidi/>
+        <w:jc w:val="right"/>
+      </w:pPr>
+      <w:r>
+        <w:t xml:space="preserve">حملة اليوم الوطني وختام السنة بمحتوى مؤسسي عالي الجودة.</w:t>
+      </w:r>
+    </w:p>
+    <w:p>
+      <w:pPr>
+        <w:numPr>
+          <w:ilvl w:val="0"/>
+          <w:numId w:val="1025"/>
+        </w:numPr>
+        <w:pStyle w:val="Compact"/>
+        <w:bidi/>
+        <w:jc w:val="right"/>
+      </w:pPr>
+      <w:r>
+        <w:t xml:space="preserve">جعل التعليق التشريعي للمؤسس يتصدر محادثة أي تشريع كبير خلال 24 ساعة (قياس عبر مرات الظهور والاقتباسات والترند).</w:t>
+      </w:r>
+    </w:p>
+    <w:p>
+      <w:pPr>
+        <w:numPr>
+          <w:ilvl w:val="0"/>
+          <w:numId w:val="1025"/>
+        </w:numPr>
+        <w:pStyle w:val="Compact"/>
+        <w:bidi/>
+        <w:jc w:val="right"/>
+      </w:pPr>
+      <w:r>
+        <w:t xml:space="preserve">تقييم شامل للسنة وبناء خطة السنة التالية بناءً على البيانات.</w:t>
+      </w:r>
+    </w:p>
+    <w:p>
+      <w:pPr>
+        <w:numPr>
+          <w:ilvl w:val="0"/>
+          <w:numId w:val="1025"/>
+        </w:numPr>
+        <w:pStyle w:val="Compact"/>
+        <w:bidi/>
+        <w:jc w:val="right"/>
+      </w:pPr>
+      <w:r>
+        <w:t xml:space="preserve">أتمتة ما أمكن (ردود، تأهيل، تقارير).</w:t>
+      </w:r>
+    </w:p>
+    <w:p>
+      <w:pPr>
+        <w:pStyle w:val="FirstParagraph"/>
         <w:bidi/>
         <w:jc w:val="right"/>
       </w:pPr>
@@ -10542,7 +11026,7 @@
       <w:pPr>
         <w:numPr>
           <w:ilvl w:val="0"/>
-          <w:numId w:val="1013"/>
+          <w:numId w:val="1026"/>
         </w:numPr>
         <w:pStyle w:val="Compact"/>
         <w:bidi/>
@@ -10556,7 +11040,7 @@
       <w:pPr>
         <w:numPr>
           <w:ilvl w:val="0"/>
-          <w:numId w:val="1013"/>
+          <w:numId w:val="1026"/>
         </w:numPr>
         <w:pStyle w:val="Compact"/>
         <w:bidi/>
@@ -10570,7 +11054,7 @@
       <w:pPr>
         <w:numPr>
           <w:ilvl w:val="0"/>
-          <w:numId w:val="1013"/>
+          <w:numId w:val="1026"/>
         </w:numPr>
         <w:pStyle w:val="Compact"/>
         <w:bidi/>
@@ -10584,7 +11068,7 @@
       <w:pPr>
         <w:numPr>
           <w:ilvl w:val="0"/>
-          <w:numId w:val="1013"/>
+          <w:numId w:val="1026"/>
         </w:numPr>
         <w:pStyle w:val="Compact"/>
         <w:bidi/>
@@ -10598,7 +11082,7 @@
       <w:pPr>
         <w:numPr>
           <w:ilvl w:val="0"/>
-          <w:numId w:val="1013"/>
+          <w:numId w:val="1026"/>
         </w:numPr>
         <w:pStyle w:val="Compact"/>
         <w:bidi/>
@@ -10612,7 +11096,7 @@
       <w:pPr>
         <w:numPr>
           <w:ilvl w:val="0"/>
-          <w:numId w:val="1013"/>
+          <w:numId w:val="1026"/>
         </w:numPr>
         <w:pStyle w:val="Compact"/>
         <w:bidi/>
@@ -10626,7 +11110,7 @@
       <w:pPr>
         <w:numPr>
           <w:ilvl w:val="0"/>
-          <w:numId w:val="1013"/>
+          <w:numId w:val="1026"/>
         </w:numPr>
         <w:pStyle w:val="Compact"/>
         <w:bidi/>
@@ -10845,7 +11329,7 @@
       <w:pPr>
         <w:numPr>
           <w:ilvl w:val="0"/>
-          <w:numId w:val="1014"/>
+          <w:numId w:val="1027"/>
         </w:numPr>
         <w:pStyle w:val="Compact"/>
         <w:bidi/>
@@ -10859,7 +11343,7 @@
       <w:pPr>
         <w:numPr>
           <w:ilvl w:val="0"/>
-          <w:numId w:val="1014"/>
+          <w:numId w:val="1027"/>
         </w:numPr>
         <w:pStyle w:val="Compact"/>
         <w:bidi/>
@@ -10873,7 +11357,7 @@
       <w:pPr>
         <w:numPr>
           <w:ilvl w:val="0"/>
-          <w:numId w:val="1014"/>
+          <w:numId w:val="1027"/>
         </w:numPr>
         <w:pStyle w:val="Compact"/>
         <w:bidi/>
@@ -10887,7 +11371,7 @@
       <w:pPr>
         <w:numPr>
           <w:ilvl w:val="0"/>
-          <w:numId w:val="1014"/>
+          <w:numId w:val="1027"/>
         </w:numPr>
         <w:pStyle w:val="Compact"/>
         <w:bidi/>
@@ -10913,7 +11397,7 @@
       <w:pPr>
         <w:numPr>
           <w:ilvl w:val="0"/>
-          <w:numId w:val="1015"/>
+          <w:numId w:val="1028"/>
         </w:numPr>
         <w:pStyle w:val="Compact"/>
         <w:bidi/>
@@ -10927,7 +11411,7 @@
       <w:pPr>
         <w:numPr>
           <w:ilvl w:val="0"/>
-          <w:numId w:val="1015"/>
+          <w:numId w:val="1028"/>
         </w:numPr>
         <w:pStyle w:val="Compact"/>
         <w:bidi/>
@@ -10941,7 +11425,7 @@
       <w:pPr>
         <w:numPr>
           <w:ilvl w:val="0"/>
-          <w:numId w:val="1015"/>
+          <w:numId w:val="1028"/>
         </w:numPr>
         <w:pStyle w:val="Compact"/>
         <w:bidi/>
@@ -10955,7 +11439,7 @@
       <w:pPr>
         <w:numPr>
           <w:ilvl w:val="0"/>
-          <w:numId w:val="1015"/>
+          <w:numId w:val="1028"/>
         </w:numPr>
         <w:pStyle w:val="Compact"/>
         <w:bidi/>
@@ -11532,7 +12016,7 @@
       <w:pPr>
         <w:numPr>
           <w:ilvl w:val="0"/>
-          <w:numId w:val="1016"/>
+          <w:numId w:val="1029"/>
         </w:numPr>
         <w:pStyle w:val="Compact"/>
         <w:bidi/>
@@ -11556,7 +12040,7 @@
       <w:pPr>
         <w:numPr>
           <w:ilvl w:val="0"/>
-          <w:numId w:val="1016"/>
+          <w:numId w:val="1029"/>
         </w:numPr>
         <w:pStyle w:val="Compact"/>
         <w:bidi/>
@@ -11580,7 +12064,7 @@
       <w:pPr>
         <w:numPr>
           <w:ilvl w:val="0"/>
-          <w:numId w:val="1016"/>
+          <w:numId w:val="1029"/>
         </w:numPr>
         <w:pStyle w:val="Compact"/>
         <w:bidi/>
@@ -11604,7 +12088,7 @@
       <w:pPr>
         <w:numPr>
           <w:ilvl w:val="0"/>
-          <w:numId w:val="1016"/>
+          <w:numId w:val="1029"/>
         </w:numPr>
         <w:pStyle w:val="Compact"/>
         <w:bidi/>
@@ -11628,7 +12112,7 @@
       <w:pPr>
         <w:numPr>
           <w:ilvl w:val="0"/>
-          <w:numId w:val="1016"/>
+          <w:numId w:val="1029"/>
         </w:numPr>
         <w:pStyle w:val="Compact"/>
         <w:bidi/>
@@ -11667,7 +12151,7 @@
       <w:pPr>
         <w:numPr>
           <w:ilvl w:val="0"/>
-          <w:numId w:val="1016"/>
+          <w:numId w:val="1029"/>
         </w:numPr>
         <w:pStyle w:val="Compact"/>
         <w:bidi/>
@@ -11764,7 +12248,7 @@
       <w:pPr>
         <w:numPr>
           <w:ilvl w:val="0"/>
-          <w:numId w:val="1017"/>
+          <w:numId w:val="1030"/>
         </w:numPr>
         <w:pStyle w:val="Compact"/>
         <w:bidi/>
@@ -11794,7 +12278,7 @@
       <w:pPr>
         <w:numPr>
           <w:ilvl w:val="0"/>
-          <w:numId w:val="1017"/>
+          <w:numId w:val="1030"/>
         </w:numPr>
         <w:pStyle w:val="Compact"/>
         <w:bidi/>
@@ -11818,7 +12302,7 @@
       <w:pPr>
         <w:numPr>
           <w:ilvl w:val="0"/>
-          <w:numId w:val="1017"/>
+          <w:numId w:val="1030"/>
         </w:numPr>
         <w:pStyle w:val="Compact"/>
         <w:bidi/>
@@ -11854,7 +12338,7 @@
       <w:pPr>
         <w:numPr>
           <w:ilvl w:val="0"/>
-          <w:numId w:val="1018"/>
+          <w:numId w:val="1031"/>
         </w:numPr>
         <w:pStyle w:val="Compact"/>
         <w:bidi/>
@@ -11868,7 +12352,7 @@
       <w:pPr>
         <w:numPr>
           <w:ilvl w:val="0"/>
-          <w:numId w:val="1018"/>
+          <w:numId w:val="1031"/>
         </w:numPr>
         <w:pStyle w:val="Compact"/>
         <w:bidi/>
@@ -11882,7 +12366,7 @@
       <w:pPr>
         <w:numPr>
           <w:ilvl w:val="0"/>
-          <w:numId w:val="1018"/>
+          <w:numId w:val="1031"/>
         </w:numPr>
         <w:pStyle w:val="Compact"/>
         <w:bidi/>
@@ -11896,7 +12380,7 @@
       <w:pPr>
         <w:numPr>
           <w:ilvl w:val="0"/>
-          <w:numId w:val="1018"/>
+          <w:numId w:val="1031"/>
         </w:numPr>
         <w:pStyle w:val="Compact"/>
         <w:bidi/>
@@ -11910,7 +12394,7 @@
       <w:pPr>
         <w:numPr>
           <w:ilvl w:val="0"/>
-          <w:numId w:val="1018"/>
+          <w:numId w:val="1031"/>
         </w:numPr>
         <w:pStyle w:val="Compact"/>
         <w:bidi/>
@@ -12561,7 +13045,7 @@
       <w:pPr>
         <w:numPr>
           <w:ilvl w:val="0"/>
-          <w:numId w:val="1019"/>
+          <w:numId w:val="1032"/>
         </w:numPr>
         <w:pStyle w:val="Compact"/>
         <w:bidi/>
@@ -12585,7 +13069,7 @@
       <w:pPr>
         <w:numPr>
           <w:ilvl w:val="0"/>
-          <w:numId w:val="1019"/>
+          <w:numId w:val="1032"/>
         </w:numPr>
         <w:pStyle w:val="Compact"/>
         <w:bidi/>
@@ -12609,7 +13093,7 @@
       <w:pPr>
         <w:numPr>
           <w:ilvl w:val="0"/>
-          <w:numId w:val="1019"/>
+          <w:numId w:val="1032"/>
         </w:numPr>
         <w:pStyle w:val="Compact"/>
         <w:bidi/>
@@ -12633,7 +13117,7 @@
       <w:pPr>
         <w:numPr>
           <w:ilvl w:val="0"/>
-          <w:numId w:val="1019"/>
+          <w:numId w:val="1032"/>
         </w:numPr>
         <w:pStyle w:val="Compact"/>
         <w:bidi/>
@@ -12657,7 +13141,7 @@
       <w:pPr>
         <w:numPr>
           <w:ilvl w:val="0"/>
-          <w:numId w:val="1019"/>
+          <w:numId w:val="1032"/>
         </w:numPr>
         <w:pStyle w:val="Compact"/>
         <w:bidi/>
@@ -12693,7 +13177,7 @@
       <w:pPr>
         <w:numPr>
           <w:ilvl w:val="0"/>
-          <w:numId w:val="1020"/>
+          <w:numId w:val="1033"/>
         </w:numPr>
         <w:pStyle w:val="Compact"/>
         <w:bidi/>
@@ -12707,7 +13191,7 @@
       <w:pPr>
         <w:numPr>
           <w:ilvl w:val="0"/>
-          <w:numId w:val="1020"/>
+          <w:numId w:val="1033"/>
         </w:numPr>
         <w:pStyle w:val="Compact"/>
         <w:bidi/>
@@ -12721,7 +13205,7 @@
       <w:pPr>
         <w:numPr>
           <w:ilvl w:val="0"/>
-          <w:numId w:val="1020"/>
+          <w:numId w:val="1033"/>
         </w:numPr>
         <w:pStyle w:val="Compact"/>
         <w:bidi/>
@@ -12735,7 +13219,7 @@
       <w:pPr>
         <w:numPr>
           <w:ilvl w:val="0"/>
-          <w:numId w:val="1020"/>
+          <w:numId w:val="1033"/>
         </w:numPr>
         <w:pStyle w:val="Compact"/>
         <w:bidi/>
@@ -12749,7 +13233,7 @@
       <w:pPr>
         <w:numPr>
           <w:ilvl w:val="0"/>
-          <w:numId w:val="1020"/>
+          <w:numId w:val="1033"/>
         </w:numPr>
         <w:pStyle w:val="Compact"/>
         <w:bidi/>
@@ -12763,7 +13247,7 @@
       <w:pPr>
         <w:numPr>
           <w:ilvl w:val="0"/>
-          <w:numId w:val="1020"/>
+          <w:numId w:val="1033"/>
         </w:numPr>
         <w:pStyle w:val="Compact"/>
         <w:bidi/>
@@ -13749,7 +14233,7 @@
       <w:pPr>
         <w:numPr>
           <w:ilvl w:val="0"/>
-          <w:numId w:val="1021"/>
+          <w:numId w:val="1034"/>
         </w:numPr>
         <w:pStyle w:val="Compact"/>
         <w:bidi/>
@@ -13773,7 +14257,7 @@
       <w:pPr>
         <w:numPr>
           <w:ilvl w:val="0"/>
-          <w:numId w:val="1021"/>
+          <w:numId w:val="1034"/>
         </w:numPr>
         <w:pStyle w:val="Compact"/>
         <w:bidi/>
@@ -13797,7 +14281,7 @@
       <w:pPr>
         <w:numPr>
           <w:ilvl w:val="0"/>
-          <w:numId w:val="1021"/>
+          <w:numId w:val="1034"/>
         </w:numPr>
         <w:pStyle w:val="Compact"/>
         <w:bidi/>
@@ -13821,7 +14305,7 @@
       <w:pPr>
         <w:numPr>
           <w:ilvl w:val="0"/>
-          <w:numId w:val="1021"/>
+          <w:numId w:val="1034"/>
         </w:numPr>
         <w:pStyle w:val="Compact"/>
         <w:bidi/>
@@ -13845,7 +14329,7 @@
       <w:pPr>
         <w:numPr>
           <w:ilvl w:val="0"/>
-          <w:numId w:val="1021"/>
+          <w:numId w:val="1034"/>
         </w:numPr>
         <w:pStyle w:val="Compact"/>
         <w:bidi/>
@@ -13869,7 +14353,7 @@
       <w:pPr>
         <w:numPr>
           <w:ilvl w:val="0"/>
-          <w:numId w:val="1021"/>
+          <w:numId w:val="1034"/>
         </w:numPr>
         <w:pStyle w:val="Compact"/>
         <w:bidi/>
@@ -13893,7 +14377,7 @@
       <w:pPr>
         <w:numPr>
           <w:ilvl w:val="0"/>
-          <w:numId w:val="1021"/>
+          <w:numId w:val="1034"/>
         </w:numPr>
         <w:pStyle w:val="Compact"/>
         <w:bidi/>
@@ -13917,7 +14401,7 @@
       <w:pPr>
         <w:numPr>
           <w:ilvl w:val="0"/>
-          <w:numId w:val="1021"/>
+          <w:numId w:val="1034"/>
         </w:numPr>
         <w:pStyle w:val="Compact"/>
         <w:bidi/>
@@ -13976,7 +14460,7 @@
       <w:pPr>
         <w:numPr>
           <w:ilvl w:val="0"/>
-          <w:numId w:val="1022"/>
+          <w:numId w:val="1035"/>
         </w:numPr>
         <w:pStyle w:val="Compact"/>
         <w:bidi/>
@@ -13990,7 +14474,7 @@
       <w:pPr>
         <w:numPr>
           <w:ilvl w:val="0"/>
-          <w:numId w:val="1022"/>
+          <w:numId w:val="1035"/>
         </w:numPr>
         <w:pStyle w:val="Compact"/>
         <w:bidi/>
@@ -14004,7 +14488,7 @@
       <w:pPr>
         <w:numPr>
           <w:ilvl w:val="0"/>
-          <w:numId w:val="1022"/>
+          <w:numId w:val="1035"/>
         </w:numPr>
         <w:pStyle w:val="Compact"/>
         <w:bidi/>
@@ -14018,7 +14502,7 @@
       <w:pPr>
         <w:numPr>
           <w:ilvl w:val="0"/>
-          <w:numId w:val="1022"/>
+          <w:numId w:val="1035"/>
         </w:numPr>
         <w:pStyle w:val="Compact"/>
         <w:bidi/>
@@ -14032,7 +14516,7 @@
       <w:pPr>
         <w:numPr>
           <w:ilvl w:val="0"/>
-          <w:numId w:val="1022"/>
+          <w:numId w:val="1035"/>
         </w:numPr>
         <w:pStyle w:val="Compact"/>
         <w:bidi/>
@@ -14626,7 +15110,7 @@
       <w:pPr>
         <w:numPr>
           <w:ilvl w:val="0"/>
-          <w:numId w:val="1023"/>
+          <w:numId w:val="1036"/>
         </w:numPr>
         <w:pStyle w:val="Compact"/>
         <w:bidi/>
@@ -14640,7 +15124,7 @@
       <w:pPr>
         <w:numPr>
           <w:ilvl w:val="0"/>
-          <w:numId w:val="1023"/>
+          <w:numId w:val="1036"/>
         </w:numPr>
         <w:pStyle w:val="Compact"/>
         <w:bidi/>
@@ -14654,7 +15138,7 @@
       <w:pPr>
         <w:numPr>
           <w:ilvl w:val="0"/>
-          <w:numId w:val="1023"/>
+          <w:numId w:val="1036"/>
         </w:numPr>
         <w:pStyle w:val="Compact"/>
         <w:bidi/>
@@ -14668,7 +15152,7 @@
       <w:pPr>
         <w:numPr>
           <w:ilvl w:val="0"/>
-          <w:numId w:val="1023"/>
+          <w:numId w:val="1036"/>
         </w:numPr>
         <w:pStyle w:val="Compact"/>
         <w:bidi/>
@@ -14682,7 +15166,7 @@
       <w:pPr>
         <w:numPr>
           <w:ilvl w:val="0"/>
-          <w:numId w:val="1023"/>
+          <w:numId w:val="1036"/>
         </w:numPr>
         <w:pStyle w:val="Compact"/>
         <w:bidi/>
@@ -16662,7 +17146,7 @@
       <w:pPr>
         <w:numPr>
           <w:ilvl w:val="0"/>
-          <w:numId w:val="1024"/>
+          <w:numId w:val="1037"/>
         </w:numPr>
         <w:pStyle w:val="Compact"/>
         <w:bidi/>
@@ -16676,7 +17160,7 @@
       <w:pPr>
         <w:numPr>
           <w:ilvl w:val="0"/>
-          <w:numId w:val="1024"/>
+          <w:numId w:val="1037"/>
         </w:numPr>
         <w:pStyle w:val="Compact"/>
         <w:bidi/>
@@ -16690,7 +17174,7 @@
       <w:pPr>
         <w:numPr>
           <w:ilvl w:val="0"/>
-          <w:numId w:val="1024"/>
+          <w:numId w:val="1037"/>
         </w:numPr>
         <w:pStyle w:val="Compact"/>
         <w:bidi/>
@@ -16704,7 +17188,7 @@
       <w:pPr>
         <w:numPr>
           <w:ilvl w:val="0"/>
-          <w:numId w:val="1024"/>
+          <w:numId w:val="1037"/>
         </w:numPr>
         <w:pStyle w:val="Compact"/>
         <w:bidi/>
@@ -16718,7 +17202,7 @@
       <w:pPr>
         <w:numPr>
           <w:ilvl w:val="0"/>
-          <w:numId w:val="1024"/>
+          <w:numId w:val="1037"/>
         </w:numPr>
         <w:pStyle w:val="Compact"/>
         <w:bidi/>
@@ -16744,7 +17228,7 @@
       <w:pPr>
         <w:numPr>
           <w:ilvl w:val="0"/>
-          <w:numId w:val="1025"/>
+          <w:numId w:val="1038"/>
         </w:numPr>
         <w:pStyle w:val="Compact"/>
         <w:bidi/>
@@ -16758,7 +17242,7 @@
       <w:pPr>
         <w:numPr>
           <w:ilvl w:val="0"/>
-          <w:numId w:val="1025"/>
+          <w:numId w:val="1038"/>
         </w:numPr>
         <w:pStyle w:val="Compact"/>
         <w:bidi/>
@@ -16772,7 +17256,7 @@
       <w:pPr>
         <w:numPr>
           <w:ilvl w:val="0"/>
-          <w:numId w:val="1025"/>
+          <w:numId w:val="1038"/>
         </w:numPr>
         <w:pStyle w:val="Compact"/>
         <w:bidi/>
@@ -16786,7 +17270,7 @@
       <w:pPr>
         <w:numPr>
           <w:ilvl w:val="0"/>
-          <w:numId w:val="1025"/>
+          <w:numId w:val="1038"/>
         </w:numPr>
         <w:pStyle w:val="Compact"/>
         <w:bidi/>
@@ -16800,7 +17284,7 @@
       <w:pPr>
         <w:numPr>
           <w:ilvl w:val="0"/>
-          <w:numId w:val="1025"/>
+          <w:numId w:val="1038"/>
         </w:numPr>
         <w:pStyle w:val="Compact"/>
         <w:bidi/>
@@ -16814,7 +17298,7 @@
       <w:pPr>
         <w:numPr>
           <w:ilvl w:val="0"/>
-          <w:numId w:val="1025"/>
+          <w:numId w:val="1038"/>
         </w:numPr>
         <w:pStyle w:val="Compact"/>
         <w:bidi/>
@@ -16828,7 +17312,7 @@
       <w:pPr>
         <w:numPr>
           <w:ilvl w:val="0"/>
-          <w:numId w:val="1025"/>
+          <w:numId w:val="1038"/>
         </w:numPr>
         <w:pStyle w:val="Compact"/>
         <w:bidi/>
@@ -16842,7 +17326,7 @@
       <w:pPr>
         <w:numPr>
           <w:ilvl w:val="0"/>
-          <w:numId w:val="1025"/>
+          <w:numId w:val="1038"/>
         </w:numPr>
         <w:pStyle w:val="Compact"/>
         <w:bidi/>
@@ -16856,7 +17340,7 @@
       <w:pPr>
         <w:numPr>
           <w:ilvl w:val="0"/>
-          <w:numId w:val="1025"/>
+          <w:numId w:val="1038"/>
         </w:numPr>
         <w:pStyle w:val="Compact"/>
         <w:bidi/>
@@ -17267,9 +17751,6 @@
     <w:abstractNumId w:val="991"/>
   </w:num>
   <w:num w:numId="1008">
-    <w:abstractNumId w:val="991"/>
-  </w:num>
-  <w:num w:numId="1009">
     <w:abstractNumId w:val="99411"/>
     <w:lvlOverride w:ilvl="0">
       <w:startOverride w:val="1"/>
@@ -17299,6 +17780,9 @@
       <w:startOverride w:val="1"/>
     </w:lvlOverride>
   </w:num>
+  <w:num w:numId="1009">
+    <w:abstractNumId w:val="991"/>
+  </w:num>
   <w:num w:numId="1010">
     <w:abstractNumId w:val="991"/>
   </w:num>
@@ -17318,6 +17802,9 @@
     <w:abstractNumId w:val="991"/>
   </w:num>
   <w:num w:numId="1016">
+    <w:abstractNumId w:val="991"/>
+  </w:num>
+  <w:num w:numId="1017">
     <w:abstractNumId w:val="99411"/>
     <w:lvlOverride w:ilvl="0">
       <w:startOverride w:val="1"/>
@@ -17347,9 +17834,6 @@
       <w:startOverride w:val="1"/>
     </w:lvlOverride>
   </w:num>
-  <w:num w:numId="1017">
-    <w:abstractNumId w:val="991"/>
-  </w:num>
   <w:num w:numId="1018">
     <w:abstractNumId w:val="991"/>
   </w:num>
@@ -17366,6 +17850,24 @@
     <w:abstractNumId w:val="991"/>
   </w:num>
   <w:num w:numId="1023">
+    <w:abstractNumId w:val="991"/>
+  </w:num>
+  <w:num w:numId="1024">
+    <w:abstractNumId w:val="991"/>
+  </w:num>
+  <w:num w:numId="1025">
+    <w:abstractNumId w:val="991"/>
+  </w:num>
+  <w:num w:numId="1026">
+    <w:abstractNumId w:val="991"/>
+  </w:num>
+  <w:num w:numId="1027">
+    <w:abstractNumId w:val="991"/>
+  </w:num>
+  <w:num w:numId="1028">
+    <w:abstractNumId w:val="991"/>
+  </w:num>
+  <w:num w:numId="1029">
     <w:abstractNumId w:val="99411"/>
     <w:lvlOverride w:ilvl="0">
       <w:startOverride w:val="1"/>
@@ -17395,7 +17897,25 @@
       <w:startOverride w:val="1"/>
     </w:lvlOverride>
   </w:num>
-  <w:num w:numId="1024">
+  <w:num w:numId="1030">
+    <w:abstractNumId w:val="991"/>
+  </w:num>
+  <w:num w:numId="1031">
+    <w:abstractNumId w:val="991"/>
+  </w:num>
+  <w:num w:numId="1032">
+    <w:abstractNumId w:val="991"/>
+  </w:num>
+  <w:num w:numId="1033">
+    <w:abstractNumId w:val="991"/>
+  </w:num>
+  <w:num w:numId="1034">
+    <w:abstractNumId w:val="991"/>
+  </w:num>
+  <w:num w:numId="1035">
+    <w:abstractNumId w:val="991"/>
+  </w:num>
+  <w:num w:numId="1036">
     <w:abstractNumId w:val="99411"/>
     <w:lvlOverride w:ilvl="0">
       <w:startOverride w:val="1"/>
@@ -17425,7 +17945,37 @@
       <w:startOverride w:val="1"/>
     </w:lvlOverride>
   </w:num>
-  <w:num w:numId="1025">
+  <w:num w:numId="1037">
+    <w:abstractNumId w:val="99411"/>
+    <w:lvlOverride w:ilvl="0">
+      <w:startOverride w:val="1"/>
+    </w:lvlOverride>
+    <w:lvlOverride w:ilvl="1">
+      <w:startOverride w:val="1"/>
+    </w:lvlOverride>
+    <w:lvlOverride w:ilvl="2">
+      <w:startOverride w:val="1"/>
+    </w:lvlOverride>
+    <w:lvlOverride w:ilvl="3">
+      <w:startOverride w:val="1"/>
+    </w:lvlOverride>
+    <w:lvlOverride w:ilvl="4">
+      <w:startOverride w:val="1"/>
+    </w:lvlOverride>
+    <w:lvlOverride w:ilvl="5">
+      <w:startOverride w:val="1"/>
+    </w:lvlOverride>
+    <w:lvlOverride w:ilvl="6">
+      <w:startOverride w:val="1"/>
+    </w:lvlOverride>
+    <w:lvlOverride w:ilvl="7">
+      <w:startOverride w:val="1"/>
+    </w:lvlOverride>
+    <w:lvlOverride w:ilvl="8">
+      <w:startOverride w:val="1"/>
+    </w:lvlOverride>
+  </w:num>
+  <w:num w:numId="1038">
     <w:abstractNumId w:val="991"/>
   </w:num>
 </w:numbering>

</xml_diff>